<commit_message>
Promote FINAL5_5 to canonical master + add entry-point CLAUDE.md and SessionStart hook
- All cross-doc references switched from FINAL5_4 to FINAL5_5 (comp doc, resume-tailoring, resume-validation, screening_criteria, job-search-strategy)
- Comp doc: locked all FINAL5_5 bullets (NG, Comcast, Infotech VP, Director, Manager); Independent Ventures section expanded with dev-seagull project details (Lighthouse, Jingle, MailFlow, The Cat); PROMOTIONAL RESERVE section added; hard locks expanded; agentic AI and em-dash rules softened
- New CLAUDE.md at project root as entry point: doc hierarchy, workflow entry points, hard locks summary
- New .claude/settings.json with SessionStart hook to inject canonical state into every new session
- New FINAL5_5.md companion file for fast reading during tailoring (Phase 1)
- Updated .gitignore to exclude .claude/worktrees/ (auto-created snapshots)

Co-Authored-By: Claude Opus 4.7 (1M context) <noreply@anthropic.com>
</commit_message>
<xml_diff>
--- a/resumes/Maz_Mavvaj_Director_Resume_FINAL5_5.docx
+++ b/resumes/Maz_Mavvaj_Director_Resume_FINAL5_5.docx
@@ -4,6 +4,7 @@
   <w:body>
     <w:p>
       <w:pPr>
+        <w:spacing w:line="276" w:lineRule="auto"/>
         <w:rPr>
           <w:b/>
           <w:bCs/>
@@ -65,6 +66,7 @@
     </w:p>
     <w:p>
       <w:pPr>
+        <w:spacing w:line="276" w:lineRule="auto"/>
         <w:rPr>
           <w:b/>
           <w:bCs/>
@@ -81,28 +83,32 @@
           <w:sz w:val="16"/>
           <w:szCs w:val="16"/>
         </w:rPr>
-        <w:t>Technology Leader</w:t>
-      </w:r>
-    </w:p>
-    <w:p>
-      <w:pPr>
-        <w:rPr>
+        <w:t>Business</w:t>
+      </w:r>
+      <w:r>
+        <w:rPr>
+          <w:b/>
+          <w:bCs/>
           <w:color w:val="0070C0"/>
           <w:sz w:val="16"/>
           <w:szCs w:val="16"/>
         </w:rPr>
-      </w:pPr>
-      <w:r>
-        <w:rPr>
+        <w:t xml:space="preserve"> &amp; Technology</w:t>
+      </w:r>
+      <w:r>
+        <w:rPr>
+          <w:b/>
+          <w:bCs/>
           <w:color w:val="0070C0"/>
           <w:sz w:val="16"/>
           <w:szCs w:val="16"/>
         </w:rPr>
-        <w:t>Business Operator • Product Innovator • PMO Orchestrator</w:t>
-      </w:r>
-    </w:p>
-    <w:p>
-      <w:pPr>
+        <w:t xml:space="preserve"> Leader</w:t>
+      </w:r>
+    </w:p>
+    <w:p>
+      <w:pPr>
+        <w:spacing w:line="276" w:lineRule="auto"/>
         <w:rPr>
           <w:color w:val="0070C0"/>
           <w:sz w:val="16"/>
@@ -115,11 +121,136 @@
           <w:sz w:val="16"/>
           <w:szCs w:val="16"/>
         </w:rPr>
-        <w:t>AI-Augmented Ops • Payment Services • Regulated Platforms</w:t>
-      </w:r>
-    </w:p>
-    <w:p>
-      <w:pPr>
+        <w:t xml:space="preserve">Product • </w:t>
+      </w:r>
+      <w:r>
+        <w:rPr>
+          <w:color w:val="0070C0"/>
+          <w:sz w:val="16"/>
+          <w:szCs w:val="16"/>
+        </w:rPr>
+        <w:t xml:space="preserve">Operations </w:t>
+      </w:r>
+      <w:r>
+        <w:rPr>
+          <w:color w:val="0070C0"/>
+          <w:sz w:val="16"/>
+          <w:szCs w:val="16"/>
+        </w:rPr>
+        <w:t xml:space="preserve">• </w:t>
+      </w:r>
+      <w:r>
+        <w:rPr>
+          <w:color w:val="0070C0"/>
+          <w:sz w:val="16"/>
+          <w:szCs w:val="16"/>
+        </w:rPr>
+        <w:t xml:space="preserve">Engineering </w:t>
+      </w:r>
+      <w:r>
+        <w:rPr>
+          <w:color w:val="0070C0"/>
+          <w:sz w:val="16"/>
+          <w:szCs w:val="16"/>
+        </w:rPr>
+        <w:t xml:space="preserve">• </w:t>
+      </w:r>
+      <w:r>
+        <w:rPr>
+          <w:color w:val="0070C0"/>
+          <w:sz w:val="16"/>
+          <w:szCs w:val="16"/>
+        </w:rPr>
+        <w:t>Monetization</w:t>
+      </w:r>
+    </w:p>
+    <w:p>
+      <w:pPr>
+        <w:spacing w:line="276" w:lineRule="auto"/>
+        <w:rPr>
+          <w:b/>
+          <w:bCs/>
+          <w:color w:val="0070C0"/>
+          <w:sz w:val="16"/>
+          <w:szCs w:val="16"/>
+        </w:rPr>
+      </w:pPr>
+      <w:r>
+        <w:rPr>
+          <w:color w:val="0070C0"/>
+          <w:sz w:val="16"/>
+          <w:szCs w:val="16"/>
+        </w:rPr>
+        <w:t>AI-Augmented Ops • Regulated Platforms</w:t>
+      </w:r>
+      <w:r>
+        <w:rPr>
+          <w:color w:val="0070C0"/>
+          <w:sz w:val="16"/>
+          <w:szCs w:val="16"/>
+        </w:rPr>
+        <w:t xml:space="preserve"> </w:t>
+      </w:r>
+      <w:r>
+        <w:rPr>
+          <w:color w:val="0070C0"/>
+          <w:sz w:val="16"/>
+          <w:szCs w:val="16"/>
+        </w:rPr>
+        <w:t xml:space="preserve">• </w:t>
+      </w:r>
+      <w:r>
+        <w:rPr>
+          <w:color w:val="0070C0"/>
+          <w:sz w:val="16"/>
+          <w:szCs w:val="16"/>
+        </w:rPr>
+        <w:t xml:space="preserve">FinTech </w:t>
+      </w:r>
+      <w:r>
+        <w:rPr>
+          <w:color w:val="0070C0"/>
+          <w:sz w:val="16"/>
+          <w:szCs w:val="16"/>
+        </w:rPr>
+        <w:t xml:space="preserve">• </w:t>
+      </w:r>
+      <w:r>
+        <w:rPr>
+          <w:color w:val="0070C0"/>
+          <w:sz w:val="16"/>
+          <w:szCs w:val="16"/>
+        </w:rPr>
+        <w:t>Telecom</w:t>
+      </w:r>
+      <w:r>
+        <w:rPr>
+          <w:color w:val="0070C0"/>
+          <w:sz w:val="16"/>
+          <w:szCs w:val="16"/>
+        </w:rPr>
+        <w:t xml:space="preserve"> • </w:t>
+      </w:r>
+      <w:r>
+        <w:rPr>
+          <w:color w:val="0070C0"/>
+          <w:sz w:val="16"/>
+          <w:szCs w:val="16"/>
+        </w:rPr>
+        <w:t>Energy</w:t>
+      </w:r>
+      <w:r>
+        <w:rPr>
+          <w:color w:val="0070C0"/>
+          <w:sz w:val="16"/>
+          <w:szCs w:val="16"/>
+        </w:rPr>
+        <w:t xml:space="preserve"> </w:t>
+      </w:r>
+    </w:p>
+    <w:p>
+      <w:pPr>
+        <w:spacing w:line="276" w:lineRule="auto"/>
         <w:jc w:val="right"/>
         <w:rPr>
           <w:color w:val="AAAAAA"/>
@@ -148,6 +279,7 @@
     </w:p>
     <w:p>
       <w:pPr>
+        <w:spacing w:line="276" w:lineRule="auto"/>
         <w:jc w:val="right"/>
         <w:rPr>
           <w:color w:val="AAAAAA"/>
@@ -174,6 +306,7 @@
     </w:p>
     <w:p>
       <w:pPr>
+        <w:spacing w:line="276" w:lineRule="auto"/>
         <w:jc w:val="right"/>
         <w:rPr>
           <w:sz w:val="18"/>
@@ -191,7 +324,7 @@
     </w:p>
     <w:p>
       <w:pPr>
-        <w:spacing w:before="220" w:after="60"/>
+        <w:spacing w:before="220" w:after="60" w:line="276" w:lineRule="auto"/>
         <w:rPr>
           <w:b/>
           <w:bCs/>
@@ -206,8 +339,8 @@
           <w:pgMar w:top="680" w:right="800" w:bottom="680" w:left="800" w:header="708" w:footer="708" w:gutter="0"/>
           <w:cols w:num="3" w:space="144" w:equalWidth="0">
             <w:col w:w="2592" w:space="144"/>
-            <w:col w:w="4512" w:space="144"/>
-            <w:col w:w="3248"/>
+            <w:col w:w="4752" w:space="144"/>
+            <w:col w:w="3008"/>
           </w:cols>
           <w:titlePg/>
           <w:docGrid w:linePitch="360"/>
@@ -219,7 +352,7 @@
         <w:pBdr>
           <w:bottom w:val="single" w:sz="8" w:space="1" w:color="0070C0"/>
         </w:pBdr>
-        <w:spacing w:before="240" w:line="276" w:lineRule="auto"/>
+        <w:spacing w:before="240"/>
         <w:rPr>
           <w:color w:val="0070C0"/>
           <w:sz w:val="18"/>
@@ -272,7 +405,20 @@
         <w:t>operations</w:t>
       </w:r>
       <w:r>
-        <w:t xml:space="preserve">, and </w:t>
+        <w:t xml:space="preserve">, </w:t>
+      </w:r>
+      <w:r>
+        <w:rPr>
+          <w:b/>
+          <w:bCs/>
+        </w:rPr>
+        <w:t>engineering</w:t>
+      </w:r>
+      <w:r>
+        <w:t xml:space="preserve"> </w:t>
+      </w:r>
+      <w:r>
+        <w:t xml:space="preserve">and </w:t>
       </w:r>
       <w:r>
         <w:rPr>
@@ -282,89 +428,92 @@
         <w:t>platforms</w:t>
       </w:r>
       <w:r>
-        <w:t xml:space="preserve"> — in three regulated industries and four continents. </w:t>
-      </w:r>
+        <w:t xml:space="preserve"> — in </w:t>
+      </w:r>
+      <w:r>
+        <w:t>multiple</w:t>
+      </w:r>
+      <w:r>
+        <w:t xml:space="preserve"> regulated industries and four continents. </w:t>
+      </w:r>
+    </w:p>
+    <w:p>
+      <w:pPr>
+        <w:pStyle w:val="ListParagraph"/>
+        <w:numPr>
+          <w:ilvl w:val="0"/>
+          <w:numId w:val="2"/>
+        </w:numPr>
+        <w:spacing w:before="30" w:after="30" w:line="276" w:lineRule="auto"/>
+      </w:pPr>
+      <w:r>
+        <w:t xml:space="preserve">Scaled a stalled fintech 10K </w:t>
+      </w:r>
+      <w:r>
+        <w:sym w:font="Wingdings" w:char="F0E0"/>
+      </w:r>
+      <w:r>
+        <w:t xml:space="preserve"> 120K merchants in 18 months; co-architected national payment network across 30+ FIs.</w:t>
+      </w:r>
+    </w:p>
+    <w:p>
+      <w:pPr>
+        <w:pStyle w:val="ListParagraph"/>
+        <w:numPr>
+          <w:ilvl w:val="0"/>
+          <w:numId w:val="2"/>
+        </w:numPr>
+        <w:spacing w:before="30" w:after="30" w:line="276" w:lineRule="auto"/>
+      </w:pPr>
+      <w:r>
+        <w:t>Tripled Fortune 50 deployment throughput at half the resources; built crisis-response analytics enterprise-wide.</w:t>
+      </w:r>
+    </w:p>
+    <w:p>
+      <w:pPr>
+        <w:pStyle w:val="ListParagraph"/>
+        <w:numPr>
+          <w:ilvl w:val="0"/>
+          <w:numId w:val="2"/>
+        </w:numPr>
+        <w:spacing w:before="30" w:after="30" w:line="276" w:lineRule="auto"/>
+      </w:pPr>
+      <w:r>
+        <w:t xml:space="preserve">Operate $1.4B+ regulated platform (~2M meters, NY/MA); </w:t>
+      </w:r>
+      <w:r>
+        <w:t>established</w:t>
+      </w:r>
+      <w:r>
+        <w:t xml:space="preserve"> vendor accountability framework </w:t>
+      </w:r>
+      <w:r>
+        <w:t>unlock</w:t>
+      </w:r>
+      <w:r>
+        <w:t>ing</w:t>
+      </w:r>
+      <w:r>
+        <w:t xml:space="preserve"> $2M+/month</w:t>
+      </w:r>
+      <w:r>
+        <w:t>.</w:t>
+      </w:r>
+    </w:p>
+    <w:p>
+      <w:pPr>
+        <w:spacing w:before="30" w:after="30" w:line="276" w:lineRule="auto"/>
+      </w:pPr>
       <w:r>
         <w:t>20+ years of building what doesn't exist yet: seeing problems others accept as normal, reframing them, and creating solutions that change how organizations operate.</w:t>
       </w:r>
-    </w:p>
-    <w:p>
-      <w:pPr>
-        <w:pStyle w:val="ListParagraph"/>
-        <w:numPr>
-          <w:ilvl w:val="0"/>
-          <w:numId w:val="2"/>
-        </w:numPr>
-        <w:spacing w:before="30" w:after="30" w:line="276" w:lineRule="auto"/>
-      </w:pPr>
-      <w:r>
-        <w:t>Scaled a stalled fintech 10K</w:t>
-      </w:r>
-      <w:r>
-        <w:t xml:space="preserve"> </w:t>
-      </w:r>
-      <w:r>
-        <w:sym w:font="Wingdings" w:char="F0E0"/>
-      </w:r>
-      <w:r>
-        <w:t xml:space="preserve"> 120K merchants in 18 months; co-architected national payment network across 30+ FIs.</w:t>
-      </w:r>
-    </w:p>
-    <w:p>
-      <w:pPr>
-        <w:pStyle w:val="ListParagraph"/>
-        <w:numPr>
-          <w:ilvl w:val="0"/>
-          <w:numId w:val="2"/>
-        </w:numPr>
-        <w:spacing w:before="30" w:after="30" w:line="276" w:lineRule="auto"/>
-      </w:pPr>
-      <w:r>
-        <w:t>Tripled Fortune 50 deployment throughput at half the resources; built crisis-response analytics enterprise-wide.</w:t>
-      </w:r>
-    </w:p>
-    <w:p>
-      <w:pPr>
-        <w:pStyle w:val="ListParagraph"/>
-        <w:numPr>
-          <w:ilvl w:val="0"/>
-          <w:numId w:val="2"/>
-        </w:numPr>
-        <w:spacing w:before="30" w:after="30" w:line="276" w:lineRule="auto"/>
-      </w:pPr>
-      <w:r>
-        <w:t xml:space="preserve">Operate $1.4B+ regulated platform (~2M meters, NY/MA); </w:t>
-      </w:r>
-      <w:r>
-        <w:t>established</w:t>
-      </w:r>
-      <w:r>
-        <w:t xml:space="preserve"> vendor accountability framework </w:t>
-      </w:r>
-      <w:r>
-        <w:t>unlock</w:t>
-      </w:r>
-      <w:r>
-        <w:t>ing</w:t>
-      </w:r>
-      <w:r>
-        <w:t xml:space="preserve"> $2M+/month</w:t>
-      </w:r>
-      <w:r>
-        <w:t>.</w:t>
-      </w:r>
-    </w:p>
-    <w:p>
-      <w:pPr>
-        <w:spacing w:before="30" w:after="30" w:line="276" w:lineRule="auto"/>
-      </w:pPr>
     </w:p>
     <w:p>
       <w:pPr>
         <w:pBdr>
           <w:bottom w:val="single" w:sz="8" w:space="1" w:color="0070C0"/>
         </w:pBdr>
-        <w:spacing w:before="240" w:line="276" w:lineRule="auto"/>
+        <w:spacing w:before="240"/>
         <w:rPr>
           <w:color w:val="0070C0"/>
           <w:sz w:val="22"/>
@@ -446,13 +595,7 @@
         <w:rPr>
           <w:color w:val="444444"/>
         </w:rPr>
-        <w:t>security</w:t>
-      </w:r>
-      <w:r>
-        <w:rPr>
-          <w:color w:val="444444"/>
-        </w:rPr>
-        <w:t xml:space="preserve">, </w:t>
+        <w:t xml:space="preserve">security, </w:t>
       </w:r>
       <w:r>
         <w:rPr>
@@ -559,23 +702,26 @@
         <w:t xml:space="preserve"> every </w:t>
       </w:r>
       <w:r>
-        <w:t>deliverable</w:t>
-      </w:r>
-      <w:r>
-        <w:t xml:space="preserve"> accelerated; $2M+/month was one of many gains.</w:t>
-      </w:r>
-    </w:p>
-    <w:p>
-      <w:pPr>
-        <w:pStyle w:val="ListParagraph"/>
-        <w:numPr>
-          <w:ilvl w:val="0"/>
-          <w:numId w:val="2"/>
-        </w:numPr>
-        <w:spacing w:before="30" w:after="30" w:line="276" w:lineRule="auto"/>
-      </w:pPr>
-      <w:r>
-        <w:t xml:space="preserve">Stepped in for change-management </w:t>
+        <w:t>deliverable accelerated; $2M+/month was one of many gains.</w:t>
+      </w:r>
+    </w:p>
+    <w:p>
+      <w:pPr>
+        <w:pStyle w:val="ListParagraph"/>
+        <w:numPr>
+          <w:ilvl w:val="0"/>
+          <w:numId w:val="2"/>
+        </w:numPr>
+        <w:spacing w:before="30" w:after="30" w:line="276" w:lineRule="auto"/>
+      </w:pPr>
+      <w:r>
+        <w:t>Stepped</w:t>
+      </w:r>
+      <w:r>
+        <w:t xml:space="preserve"> up to lead </w:t>
+      </w:r>
+      <w:r>
+        <w:t xml:space="preserve">change-management </w:t>
       </w:r>
       <w:r>
         <w:t>tooling and analytics</w:t>
@@ -689,13 +835,7 @@
         <w:t xml:space="preserve"> v</w:t>
       </w:r>
       <w:r>
-        <w:t>isibility gap and built analytics and automation 20+ enterprise projects relied on for ops, budgeting, risk, and procurement</w:t>
-      </w:r>
-      <w:r>
-        <w:t>s</w:t>
-      </w:r>
-      <w:r>
-        <w:t>.</w:t>
+        <w:t>isibility gap and built analytics and automation 20+ enterprise projects relied on for ops, budgeting, risk, and procurement.</w:t>
       </w:r>
     </w:p>
     <w:p>
@@ -856,7 +996,19 @@
         <w:rPr>
           <w:color w:val="444444"/>
         </w:rPr>
-        <w:t>120K-merchant</w:t>
+        <w:t>120K</w:t>
+      </w:r>
+      <w:r>
+        <w:rPr>
+          <w:color w:val="444444"/>
+        </w:rPr>
+        <w:t xml:space="preserve"> </w:t>
+      </w:r>
+      <w:r>
+        <w:rPr>
+          <w:color w:val="444444"/>
+        </w:rPr>
+        <w:t>merchant</w:t>
       </w:r>
       <w:r>
         <w:rPr>
@@ -1082,6 +1234,7 @@
           <w:ilvl w:val="0"/>
           <w:numId w:val="2"/>
         </w:numPr>
+        <w:spacing w:line="276" w:lineRule="auto"/>
       </w:pPr>
       <w:r>
         <w:t xml:space="preserve">Forged a 2M+ monthly </w:t>
@@ -1095,7 +1248,7 @@
     </w:p>
     <w:p>
       <w:pPr>
-        <w:spacing w:before="240" w:after="20"/>
+        <w:spacing w:before="240" w:after="20" w:line="276" w:lineRule="auto"/>
       </w:pPr>
       <w:r>
         <w:rPr>
@@ -1133,7 +1286,7 @@
     </w:p>
     <w:p>
       <w:pPr>
-        <w:spacing w:before="20" w:after="40" w:line="264" w:lineRule="auto"/>
+        <w:spacing w:before="20" w:after="40" w:line="276" w:lineRule="auto"/>
       </w:pPr>
       <w:r>
         <w:rPr>
@@ -1179,6 +1332,7 @@
           <w:ilvl w:val="0"/>
           <w:numId w:val="2"/>
         </w:numPr>
+        <w:spacing w:line="276" w:lineRule="auto"/>
       </w:pPr>
       <w:r>
         <w:t>Cut delivery</w:t>
@@ -1215,7 +1369,7 @@
           <w:ilvl w:val="0"/>
           <w:numId w:val="2"/>
         </w:numPr>
-        <w:spacing w:before="30" w:after="30" w:line="264" w:lineRule="auto"/>
+        <w:spacing w:before="30" w:after="30" w:line="276" w:lineRule="auto"/>
       </w:pPr>
       <w:r>
         <w:t xml:space="preserve">Scaled terminal </w:t>
@@ -1250,7 +1404,7 @@
     </w:p>
     <w:p>
       <w:pPr>
-        <w:spacing w:before="240" w:after="20"/>
+        <w:spacing w:before="240" w:after="20" w:line="276" w:lineRule="auto"/>
       </w:pPr>
       <w:r>
         <w:rPr>
@@ -1287,7 +1441,7 @@
     </w:p>
     <w:p>
       <w:pPr>
-        <w:spacing w:before="20" w:after="40" w:line="264" w:lineRule="auto"/>
+        <w:spacing w:before="20" w:after="40" w:line="276" w:lineRule="auto"/>
       </w:pPr>
       <w:r>
         <w:rPr>
@@ -1309,7 +1463,7 @@
           <w:ilvl w:val="0"/>
           <w:numId w:val="2"/>
         </w:numPr>
-        <w:spacing w:before="30" w:after="30" w:line="264" w:lineRule="auto"/>
+        <w:spacing w:before="30" w:after="30" w:line="276" w:lineRule="auto"/>
       </w:pPr>
       <w:r>
         <w:t>First remote terminal management system, eliminating physical servicing nationwide.</w:t>
@@ -1322,7 +1476,7 @@
           <w:ilvl w:val="0"/>
           <w:numId w:val="2"/>
         </w:numPr>
-        <w:spacing w:before="30" w:after="30" w:line="264" w:lineRule="auto"/>
+        <w:spacing w:before="30" w:after="30" w:line="276" w:lineRule="auto"/>
       </w:pPr>
       <w:r>
         <w:t>First domestic POS application to process live transactions through the national payment switch.</w:t>
@@ -1353,7 +1507,10 @@
     </w:p>
     <w:p>
       <w:pPr>
-        <w:spacing w:before="30" w:after="30" w:line="264" w:lineRule="auto"/>
+        <w:spacing w:before="30" w:after="30" w:line="276" w:lineRule="auto"/>
+        <w:rPr>
+          <w:color w:val="444444"/>
+        </w:rPr>
       </w:pPr>
       <w:r>
         <w:rPr>
@@ -1365,6 +1522,133 @@
         <w:rPr>
           <w:color w:val="444444"/>
         </w:rPr>
+        <w:t>:</w:t>
+      </w:r>
+    </w:p>
+    <w:p>
+      <w:pPr>
+        <w:spacing w:before="30" w:after="30" w:line="276" w:lineRule="auto"/>
+        <w:rPr>
+          <w:color w:val="444444"/>
+        </w:rPr>
+      </w:pPr>
+      <w:r>
+        <w:rPr>
+          <w:color w:val="444444"/>
+        </w:rPr>
+        <w:t xml:space="preserve">Frame the problem, set the product direction, design the architecture, and decide what ships and when. Operate Claude Code end-to-end; every line </w:t>
+      </w:r>
+      <w:r>
+        <w:rPr>
+          <w:color w:val="444444"/>
+        </w:rPr>
+        <w:t xml:space="preserve">of code </w:t>
+      </w:r>
+      <w:r>
+        <w:rPr>
+          <w:color w:val="444444"/>
+        </w:rPr>
+        <w:t>is AI-written. Live to real users, shipped solo, full-stack — without an engineering team.</w:t>
+      </w:r>
+    </w:p>
+    <w:p>
+      <w:pPr>
+        <w:pStyle w:val="ListParagraph"/>
+        <w:numPr>
+          <w:ilvl w:val="0"/>
+          <w:numId w:val="2"/>
+        </w:numPr>
+        <w:spacing w:before="30" w:after="30" w:line="276" w:lineRule="auto"/>
+      </w:pPr>
+      <w:hyperlink r:id="rId9" w:history="1">
+        <w:r>
+          <w:rPr>
+            <w:rStyle w:val="Hyperlink"/>
+            <w:b/>
+            <w:bCs/>
+          </w:rPr>
+          <w:t>Project Light</w:t>
+        </w:r>
+        <w:r>
+          <w:rPr>
+            <w:rStyle w:val="Hyperlink"/>
+            <w:b/>
+            <w:bCs/>
+          </w:rPr>
+          <w:t>h</w:t>
+        </w:r>
+        <w:r>
+          <w:rPr>
+            <w:rStyle w:val="Hyperlink"/>
+            <w:b/>
+            <w:bCs/>
+          </w:rPr>
+          <w:t>ouse</w:t>
+        </w:r>
+      </w:hyperlink>
+      <w:r>
+        <w:rPr>
+          <w:b/>
+          <w:bCs/>
+        </w:rPr>
+        <w:t>:</w:t>
+      </w:r>
+      <w:r>
+        <w:rPr>
+          <w:b/>
+          <w:bCs/>
+        </w:rPr>
+        <w:t xml:space="preserve"> </w:t>
+      </w:r>
+      <w:r>
+        <w:t xml:space="preserve">Rethinking how large organizations manage priorities and risk, </w:t>
+      </w:r>
+      <w:r>
+        <w:t>replacin</w:t>
+      </w:r>
+      <w:r>
+        <w:t xml:space="preserve">g traditional PMO overhead with real-time visual alignment that requires </w:t>
+      </w:r>
+      <w:r>
+        <w:t>near-</w:t>
+      </w:r>
+      <w:r>
+        <w:t>zero active interference.</w:t>
+      </w:r>
+      <w:r>
+        <w:t xml:space="preserve"> </w:t>
+      </w:r>
+    </w:p>
+    <w:p>
+      <w:pPr>
+        <w:pStyle w:val="ListParagraph"/>
+        <w:numPr>
+          <w:ilvl w:val="0"/>
+          <w:numId w:val="2"/>
+        </w:numPr>
+        <w:spacing w:before="30" w:after="30" w:line="276" w:lineRule="auto"/>
+      </w:pPr>
+      <w:hyperlink r:id="rId10" w:history="1">
+        <w:r>
+          <w:rPr>
+            <w:rStyle w:val="Hyperlink"/>
+            <w:b/>
+            <w:bCs/>
+          </w:rPr>
+          <w:t>Jingle</w:t>
+        </w:r>
+      </w:hyperlink>
+      <w:r>
+        <w:rPr>
+          <w:b/>
+          <w:bCs/>
+        </w:rPr>
+        <w:t xml:space="preserve">: </w:t>
+      </w:r>
+      <w:r>
+        <w:t>Challenging platform lock-in by building a cross-platform music app that lets users own their data and move freely between Spotify, Apple Music, and YouTube. Live on TestFlight</w:t>
+      </w:r>
+      <w:r>
         <w:t>.</w:t>
       </w:r>
     </w:p>
@@ -1375,37 +1659,29 @@
           <w:ilvl w:val="0"/>
           <w:numId w:val="2"/>
         </w:numPr>
-        <w:spacing w:before="30" w:after="30" w:line="264" w:lineRule="auto"/>
-      </w:pPr>
-      <w:r>
-        <w:rPr>
-          <w:b/>
-          <w:bCs/>
-        </w:rPr>
-        <w:t xml:space="preserve">Project Lighthouse: </w:t>
-      </w:r>
-      <w:r>
-        <w:t>Rethinking how large organizations manage priorities and risk, replacing traditional PMO overhead with real-time visual alignment that requires zero active interference.</w:t>
-      </w:r>
-    </w:p>
-    <w:p>
-      <w:pPr>
-        <w:pStyle w:val="ListParagraph"/>
-        <w:numPr>
-          <w:ilvl w:val="0"/>
-          <w:numId w:val="2"/>
-        </w:numPr>
-        <w:spacing w:before="30" w:after="30" w:line="264" w:lineRule="auto"/>
-      </w:pPr>
-      <w:r>
-        <w:rPr>
-          <w:b/>
-          <w:bCs/>
-        </w:rPr>
-        <w:t xml:space="preserve">Jingle: </w:t>
-      </w:r>
-      <w:r>
-        <w:t>Challenging platform lock-in by building a cross-platform music app that lets users own their data and move freely between Spotify, Apple Music, and YouTube. Live on TestFlight.</w:t>
+        <w:spacing w:before="30" w:after="30" w:line="276" w:lineRule="auto"/>
+      </w:pPr>
+      <w:hyperlink r:id="rId11" w:history="1">
+        <w:r>
+          <w:rPr>
+            <w:rStyle w:val="Hyperlink"/>
+            <w:b/>
+            <w:bCs/>
+          </w:rPr>
+          <w:t>MailFlow</w:t>
+        </w:r>
+      </w:hyperlink>
+      <w:r>
+        <w:t xml:space="preserve">: </w:t>
+      </w:r>
+      <w:r>
+        <w:t xml:space="preserve">Reframing inbox as Respond/Act/Know/Ignore </w:t>
+      </w:r>
+      <w:r>
+        <w:t xml:space="preserve">actions </w:t>
+      </w:r>
+      <w:r>
+        <w:t>via autonomous AI agent with tiered LLM routing (Sonnet + Haiku).</w:t>
       </w:r>
     </w:p>
     <w:p>
@@ -1435,7 +1711,7 @@
     </w:p>
     <w:p>
       <w:pPr>
-        <w:spacing w:after="20"/>
+        <w:spacing w:after="20" w:line="276" w:lineRule="auto"/>
       </w:pPr>
       <w:r>
         <w:rPr>
@@ -1472,7 +1748,7 @@
     </w:p>
     <w:p>
       <w:pPr>
-        <w:spacing w:before="30" w:after="30" w:line="264" w:lineRule="auto"/>
+        <w:spacing w:before="30" w:after="30" w:line="276" w:lineRule="auto"/>
       </w:pPr>
       <w:r>
         <w:rPr>
@@ -1506,7 +1782,7 @@
           <w:ilvl w:val="0"/>
           <w:numId w:val="2"/>
         </w:numPr>
-        <w:spacing w:before="30" w:after="30" w:line="264" w:lineRule="auto"/>
+        <w:spacing w:before="30" w:after="30" w:line="276" w:lineRule="auto"/>
       </w:pPr>
       <w:r>
         <w:t xml:space="preserve">Designed and launched Innovation Toolbox, a graduate course in design thinking, </w:t>
@@ -1525,7 +1801,7 @@
           <w:ilvl w:val="0"/>
           <w:numId w:val="2"/>
         </w:numPr>
-        <w:spacing w:before="30" w:after="30" w:line="264" w:lineRule="auto"/>
+        <w:spacing w:before="30" w:after="30" w:line="276" w:lineRule="auto"/>
       </w:pPr>
       <w:r>
         <w:t>Modernized Database Management Systems curriculum with hands-on applied learning.</w:t>
@@ -1533,7 +1809,7 @@
     </w:p>
     <w:p>
       <w:pPr>
-        <w:spacing w:before="120" w:after="60"/>
+        <w:spacing w:before="120" w:after="60" w:line="276" w:lineRule="auto"/>
         <w:rPr>
           <w:b/>
           <w:bCs/>
@@ -1567,7 +1843,7 @@
           <w:ilvl w:val="0"/>
           <w:numId w:val="2"/>
         </w:numPr>
-        <w:spacing w:before="30" w:after="30" w:line="264" w:lineRule="auto"/>
+        <w:spacing w:before="30" w:after="30" w:line="276" w:lineRule="auto"/>
       </w:pPr>
       <w:r>
         <w:rPr>
@@ -1590,7 +1866,7 @@
           <w:ilvl w:val="0"/>
           <w:numId w:val="2"/>
         </w:numPr>
-        <w:spacing w:before="30" w:after="30" w:line="264" w:lineRule="auto"/>
+        <w:spacing w:before="30" w:after="30" w:line="276" w:lineRule="auto"/>
       </w:pPr>
       <w:r>
         <w:rPr>
@@ -1628,15 +1904,25 @@
         </w:rPr>
         <w:t>CERTIFICATIONS</w:t>
       </w:r>
-    </w:p>
-    <w:p>
-      <w:pPr>
-        <w:pStyle w:val="ListParagraph"/>
-        <w:numPr>
-          <w:ilvl w:val="0"/>
-          <w:numId w:val="2"/>
-        </w:numPr>
-        <w:spacing w:before="30" w:after="30" w:line="264" w:lineRule="auto"/>
+      <w:r>
+        <w:rPr>
+          <w:b/>
+          <w:bCs/>
+          <w:color w:val="0070C0"/>
+          <w:sz w:val="22"/>
+          <w:szCs w:val="22"/>
+        </w:rPr>
+        <w:t xml:space="preserve"> &amp; HONORS</w:t>
+      </w:r>
+    </w:p>
+    <w:p>
+      <w:pPr>
+        <w:pStyle w:val="ListParagraph"/>
+        <w:numPr>
+          <w:ilvl w:val="0"/>
+          <w:numId w:val="2"/>
+        </w:numPr>
+        <w:spacing w:before="30" w:after="30" w:line="276" w:lineRule="auto"/>
         <w:rPr>
           <w:color w:val="444444"/>
           <w:sz w:val="18"/>
@@ -1659,79 +1945,29 @@
           <w:ilvl w:val="0"/>
           <w:numId w:val="2"/>
         </w:numPr>
-        <w:spacing w:before="30" w:after="30" w:line="264" w:lineRule="auto"/>
-      </w:pPr>
-      <w:r>
-        <w:rPr>
-          <w:color w:val="444444"/>
-          <w:sz w:val="18"/>
-          <w:szCs w:val="18"/>
-        </w:rPr>
-        <w:t>PMP (PMI)</w:t>
-      </w:r>
-    </w:p>
-    <w:p>
-      <w:pPr>
-        <w:pStyle w:val="ListParagraph"/>
-        <w:numPr>
-          <w:ilvl w:val="0"/>
-          <w:numId w:val="2"/>
-        </w:numPr>
-        <w:spacing w:before="30" w:after="30" w:line="264" w:lineRule="auto"/>
-      </w:pPr>
-      <w:r>
-        <w:rPr>
-          <w:color w:val="444444"/>
-          <w:sz w:val="18"/>
-          <w:szCs w:val="18"/>
-        </w:rPr>
-        <w:t>CSPO (Scrum Alliance)</w:t>
-      </w:r>
-    </w:p>
-    <w:p>
-      <w:pPr>
-        <w:pStyle w:val="ListParagraph"/>
-        <w:numPr>
-          <w:ilvl w:val="0"/>
-          <w:numId w:val="2"/>
-        </w:numPr>
-        <w:spacing w:before="30" w:after="30" w:line="264" w:lineRule="auto"/>
-      </w:pPr>
-      <w:r>
-        <w:rPr>
-          <w:color w:val="444444"/>
-          <w:sz w:val="18"/>
-          <w:szCs w:val="18"/>
-        </w:rPr>
-        <w:t>POPM (SAFe)</w:t>
-      </w:r>
-    </w:p>
-    <w:p>
-      <w:pPr>
-        <w:pStyle w:val="ListParagraph"/>
-        <w:numPr>
-          <w:ilvl w:val="0"/>
-          <w:numId w:val="2"/>
-        </w:numPr>
-        <w:spacing w:before="30" w:after="30" w:line="264" w:lineRule="auto"/>
-      </w:pPr>
-      <w:r>
-        <w:rPr>
-          <w:color w:val="444444"/>
-          <w:sz w:val="18"/>
-          <w:szCs w:val="18"/>
-        </w:rPr>
-        <w:t>Scaled Agilist (SAFe)</w:t>
-      </w:r>
-    </w:p>
-    <w:p>
-      <w:pPr>
-        <w:pStyle w:val="ListParagraph"/>
-        <w:numPr>
-          <w:ilvl w:val="0"/>
-          <w:numId w:val="2"/>
-        </w:numPr>
-        <w:spacing w:before="30" w:after="30" w:line="264" w:lineRule="auto"/>
+        <w:rPr>
+          <w:color w:val="444444"/>
+          <w:sz w:val="18"/>
+          <w:szCs w:val="18"/>
+        </w:rPr>
+      </w:pPr>
+      <w:r>
+        <w:rPr>
+          <w:color w:val="444444"/>
+          <w:sz w:val="18"/>
+          <w:szCs w:val="18"/>
+        </w:rPr>
+        <w:t>Beta Gamma Sigma Honors Society</w:t>
+      </w:r>
+    </w:p>
+    <w:p>
+      <w:pPr>
+        <w:pStyle w:val="ListParagraph"/>
+        <w:numPr>
+          <w:ilvl w:val="0"/>
+          <w:numId w:val="2"/>
+        </w:numPr>
+        <w:spacing w:before="30" w:after="30" w:line="276" w:lineRule="auto"/>
       </w:pPr>
       <w:r>
         <w:rPr>
@@ -1749,25 +1985,41 @@
           <w:ilvl w:val="0"/>
           <w:numId w:val="2"/>
         </w:numPr>
-        <w:spacing w:before="30" w:after="30" w:line="264" w:lineRule="auto"/>
-      </w:pPr>
-      <w:r>
-        <w:rPr>
-          <w:color w:val="444444"/>
-          <w:sz w:val="18"/>
-          <w:szCs w:val="18"/>
-        </w:rPr>
-        <w:t>CPISI (SISA)</w:t>
-      </w:r>
-    </w:p>
-    <w:p>
-      <w:pPr>
-        <w:pStyle w:val="ListParagraph"/>
-        <w:numPr>
-          <w:ilvl w:val="0"/>
-          <w:numId w:val="2"/>
-        </w:numPr>
-        <w:spacing w:before="30" w:after="30" w:line="264" w:lineRule="auto"/>
+        <w:spacing w:before="30" w:after="30" w:line="276" w:lineRule="auto"/>
+      </w:pPr>
+      <w:r>
+        <w:rPr>
+          <w:color w:val="444444"/>
+          <w:sz w:val="18"/>
+          <w:szCs w:val="18"/>
+        </w:rPr>
+        <w:t>CPISI (</w:t>
+      </w:r>
+      <w:r>
+        <w:rPr>
+          <w:color w:val="444444"/>
+          <w:sz w:val="18"/>
+          <w:szCs w:val="18"/>
+        </w:rPr>
+        <w:t xml:space="preserve">Certified Card Payment Security Implementor, </w:t>
+      </w:r>
+      <w:r>
+        <w:rPr>
+          <w:color w:val="444444"/>
+          <w:sz w:val="18"/>
+          <w:szCs w:val="18"/>
+        </w:rPr>
+        <w:t>SISA)</w:t>
+      </w:r>
+    </w:p>
+    <w:p>
+      <w:pPr>
+        <w:pStyle w:val="ListParagraph"/>
+        <w:numPr>
+          <w:ilvl w:val="0"/>
+          <w:numId w:val="2"/>
+        </w:numPr>
+        <w:spacing w:before="30" w:after="30" w:line="276" w:lineRule="auto"/>
       </w:pPr>
       <w:r>
         <w:rPr>
@@ -1785,10 +2037,202 @@
         </w:rPr>
         <w:t>s</w:t>
       </w:r>
-    </w:p>
-    <w:p>
-      <w:pPr>
-        <w:spacing w:before="220" w:after="60"/>
+      <w:r>
+        <w:rPr>
+          <w:color w:val="444444"/>
+          <w:sz w:val="18"/>
+          <w:szCs w:val="18"/>
+        </w:rPr>
+        <w:t xml:space="preserve"> (</w:t>
+      </w:r>
+      <w:r>
+        <w:rPr>
+          <w:color w:val="444444"/>
+          <w:sz w:val="18"/>
+          <w:szCs w:val="18"/>
+        </w:rPr>
+        <w:t>Certified Smart Card Industry Professional</w:t>
+      </w:r>
+      <w:r>
+        <w:rPr>
+          <w:color w:val="444444"/>
+          <w:sz w:val="18"/>
+          <w:szCs w:val="18"/>
+        </w:rPr>
+        <w:t>)</w:t>
+      </w:r>
+    </w:p>
+    <w:p>
+      <w:pPr>
+        <w:pStyle w:val="ListParagraph"/>
+        <w:numPr>
+          <w:ilvl w:val="0"/>
+          <w:numId w:val="2"/>
+        </w:numPr>
+        <w:spacing w:before="30" w:after="30" w:line="276" w:lineRule="auto"/>
+      </w:pPr>
+      <w:r>
+        <w:rPr>
+          <w:color w:val="444444"/>
+          <w:sz w:val="18"/>
+          <w:szCs w:val="18"/>
+        </w:rPr>
+        <w:t>PMP (</w:t>
+      </w:r>
+      <w:r>
+        <w:rPr>
+          <w:color w:val="444444"/>
+          <w:sz w:val="18"/>
+          <w:szCs w:val="18"/>
+        </w:rPr>
+        <w:t xml:space="preserve">Project Management Professional, </w:t>
+      </w:r>
+      <w:r>
+        <w:rPr>
+          <w:color w:val="444444"/>
+          <w:sz w:val="18"/>
+          <w:szCs w:val="18"/>
+        </w:rPr>
+        <w:t>PMI)</w:t>
+      </w:r>
+    </w:p>
+    <w:p>
+      <w:pPr>
+        <w:pStyle w:val="ListParagraph"/>
+        <w:numPr>
+          <w:ilvl w:val="0"/>
+          <w:numId w:val="2"/>
+        </w:numPr>
+        <w:spacing w:before="30" w:after="30" w:line="276" w:lineRule="auto"/>
+      </w:pPr>
+      <w:r>
+        <w:rPr>
+          <w:color w:val="444444"/>
+          <w:sz w:val="18"/>
+          <w:szCs w:val="18"/>
+        </w:rPr>
+        <w:t xml:space="preserve">CSPO </w:t>
+      </w:r>
+      <w:r>
+        <w:rPr>
+          <w:color w:val="444444"/>
+          <w:sz w:val="18"/>
+          <w:szCs w:val="18"/>
+        </w:rPr>
+        <w:t>(C</w:t>
+      </w:r>
+      <w:r>
+        <w:rPr>
+          <w:color w:val="444444"/>
+          <w:sz w:val="18"/>
+          <w:szCs w:val="18"/>
+        </w:rPr>
+        <w:t>ertified Scrum Product Owner</w:t>
+      </w:r>
+      <w:r>
+        <w:rPr>
+          <w:color w:val="444444"/>
+          <w:sz w:val="18"/>
+          <w:szCs w:val="18"/>
+        </w:rPr>
+        <w:t>,</w:t>
+      </w:r>
+      <w:r>
+        <w:rPr>
+          <w:color w:val="444444"/>
+          <w:sz w:val="18"/>
+          <w:szCs w:val="18"/>
+        </w:rPr>
+        <w:t xml:space="preserve"> </w:t>
+      </w:r>
+      <w:r>
+        <w:rPr>
+          <w:color w:val="444444"/>
+          <w:sz w:val="18"/>
+          <w:szCs w:val="18"/>
+        </w:rPr>
+        <w:t>Scrum Alliance)</w:t>
+      </w:r>
+    </w:p>
+    <w:p>
+      <w:pPr>
+        <w:pStyle w:val="ListParagraph"/>
+        <w:numPr>
+          <w:ilvl w:val="0"/>
+          <w:numId w:val="2"/>
+        </w:numPr>
+        <w:spacing w:before="30" w:after="30" w:line="276" w:lineRule="auto"/>
+      </w:pPr>
+      <w:r>
+        <w:rPr>
+          <w:color w:val="444444"/>
+          <w:sz w:val="18"/>
+          <w:szCs w:val="18"/>
+        </w:rPr>
+        <w:t xml:space="preserve">POPM </w:t>
+      </w:r>
+      <w:r>
+        <w:rPr>
+          <w:color w:val="444444"/>
+          <w:sz w:val="18"/>
+          <w:szCs w:val="18"/>
+        </w:rPr>
+        <w:t xml:space="preserve">(Product Owner / Product Manager, </w:t>
+      </w:r>
+      <w:r>
+        <w:rPr>
+          <w:color w:val="444444"/>
+          <w:sz w:val="18"/>
+          <w:szCs w:val="18"/>
+        </w:rPr>
+        <w:t>SAFe)</w:t>
+      </w:r>
+    </w:p>
+    <w:p>
+      <w:pPr>
+        <w:pStyle w:val="ListParagraph"/>
+        <w:numPr>
+          <w:ilvl w:val="0"/>
+          <w:numId w:val="2"/>
+        </w:numPr>
+        <w:spacing w:before="30" w:after="30" w:line="276" w:lineRule="auto"/>
+      </w:pPr>
+      <w:r>
+        <w:rPr>
+          <w:color w:val="444444"/>
+          <w:sz w:val="18"/>
+          <w:szCs w:val="18"/>
+        </w:rPr>
+        <w:t>SA (</w:t>
+      </w:r>
+      <w:r>
+        <w:rPr>
+          <w:color w:val="444444"/>
+          <w:sz w:val="18"/>
+          <w:szCs w:val="18"/>
+        </w:rPr>
+        <w:t>Scaled Agilist</w:t>
+      </w:r>
+      <w:r>
+        <w:rPr>
+          <w:color w:val="444444"/>
+          <w:sz w:val="18"/>
+          <w:szCs w:val="18"/>
+        </w:rPr>
+        <w:t xml:space="preserve">, </w:t>
+      </w:r>
+      <w:r>
+        <w:rPr>
+          <w:color w:val="444444"/>
+          <w:sz w:val="18"/>
+          <w:szCs w:val="18"/>
+        </w:rPr>
+        <w:t>SAFe)</w:t>
+      </w:r>
+    </w:p>
+    <w:p>
+      <w:pPr>
+        <w:spacing w:before="220" w:after="60" w:line="276" w:lineRule="auto"/>
         <w:rPr>
           <w:b/>
           <w:bCs/>
@@ -1830,7 +2274,7 @@
     </w:p>
     <w:p>
       <w:pPr>
-        <w:spacing w:before="80" w:after="20" w:line="264" w:lineRule="auto"/>
+        <w:spacing w:before="80" w:after="20" w:line="276" w:lineRule="auto"/>
         <w:rPr>
           <w:color w:val="444444"/>
           <w:sz w:val="18"/>
@@ -1852,7 +2296,7 @@
           <w:ilvl w:val="0"/>
           <w:numId w:val="2"/>
         </w:numPr>
-        <w:spacing w:before="30" w:after="30" w:line="264" w:lineRule="auto"/>
+        <w:spacing w:before="30" w:after="30" w:line="276" w:lineRule="auto"/>
       </w:pPr>
       <w:r>
         <w:rPr>
@@ -1878,7 +2322,7 @@
           <w:ilvl w:val="0"/>
           <w:numId w:val="2"/>
         </w:numPr>
-        <w:spacing w:before="30" w:after="30" w:line="264" w:lineRule="auto"/>
+        <w:spacing w:before="30" w:after="30" w:line="276" w:lineRule="auto"/>
       </w:pPr>
       <w:r>
         <w:rPr>
@@ -1896,33 +2340,65 @@
           <w:ilvl w:val="0"/>
           <w:numId w:val="2"/>
         </w:numPr>
-        <w:spacing w:before="30" w:after="30" w:line="264" w:lineRule="auto"/>
-      </w:pPr>
-      <w:r>
-        <w:rPr>
-          <w:color w:val="444444"/>
-          <w:sz w:val="18"/>
-          <w:szCs w:val="18"/>
-        </w:rPr>
-        <w:t>Product Strategy, P&amp;L &amp; Go-to-Market</w:t>
-      </w:r>
-      <w:r>
-        <w:rPr>
-          <w:color w:val="444444"/>
-          <w:sz w:val="18"/>
-          <w:szCs w:val="18"/>
-        </w:rPr>
-        <w:tab/>
-      </w:r>
-    </w:p>
-    <w:p>
-      <w:pPr>
-        <w:pStyle w:val="ListParagraph"/>
-        <w:numPr>
-          <w:ilvl w:val="0"/>
-          <w:numId w:val="2"/>
-        </w:numPr>
-        <w:spacing w:before="30" w:after="30" w:line="264" w:lineRule="auto"/>
+        <w:spacing w:before="30" w:after="30" w:line="276" w:lineRule="auto"/>
+      </w:pPr>
+      <w:r>
+        <w:rPr>
+          <w:color w:val="444444"/>
+          <w:sz w:val="18"/>
+          <w:szCs w:val="18"/>
+        </w:rPr>
+        <w:t>Product</w:t>
+      </w:r>
+      <w:r>
+        <w:rPr>
+          <w:color w:val="444444"/>
+          <w:sz w:val="18"/>
+          <w:szCs w:val="18"/>
+        </w:rPr>
+        <w:t xml:space="preserve"> </w:t>
+      </w:r>
+      <w:r>
+        <w:rPr>
+          <w:color w:val="444444"/>
+          <w:sz w:val="18"/>
+          <w:szCs w:val="18"/>
+        </w:rPr>
+        <w:t xml:space="preserve">Strategy, </w:t>
+      </w:r>
+      <w:r>
+        <w:rPr>
+          <w:color w:val="444444"/>
+          <w:sz w:val="18"/>
+          <w:szCs w:val="18"/>
+        </w:rPr>
+        <w:t>Roadmapping</w:t>
+      </w:r>
+      <w:r>
+        <w:rPr>
+          <w:color w:val="444444"/>
+          <w:sz w:val="18"/>
+          <w:szCs w:val="18"/>
+        </w:rPr>
+        <w:t xml:space="preserve">, Go-to-Market and </w:t>
+      </w:r>
+      <w:r>
+        <w:rPr>
+          <w:color w:val="444444"/>
+          <w:sz w:val="18"/>
+          <w:szCs w:val="18"/>
+        </w:rPr>
+        <w:t>P&amp;L</w:t>
+      </w:r>
+    </w:p>
+    <w:p>
+      <w:pPr>
+        <w:pStyle w:val="ListParagraph"/>
+        <w:numPr>
+          <w:ilvl w:val="0"/>
+          <w:numId w:val="2"/>
+        </w:numPr>
+        <w:spacing w:before="30" w:after="30" w:line="276" w:lineRule="auto"/>
       </w:pPr>
       <w:r>
         <w:rPr>
@@ -1940,25 +2416,57 @@
           <w:ilvl w:val="0"/>
           <w:numId w:val="2"/>
         </w:numPr>
-        <w:spacing w:before="30" w:after="30" w:line="264" w:lineRule="auto"/>
-      </w:pPr>
-      <w:r>
-        <w:rPr>
-          <w:color w:val="444444"/>
-          <w:sz w:val="18"/>
-          <w:szCs w:val="18"/>
-        </w:rPr>
-        <w:t>Regulated Industry Ops (Utilities, Fintech, PCI-DSS)</w:t>
-      </w:r>
-    </w:p>
-    <w:p>
-      <w:pPr>
-        <w:pStyle w:val="ListParagraph"/>
-        <w:numPr>
-          <w:ilvl w:val="0"/>
-          <w:numId w:val="2"/>
-        </w:numPr>
-        <w:spacing w:before="30" w:after="30" w:line="264" w:lineRule="auto"/>
+        <w:spacing w:before="30" w:after="30" w:line="276" w:lineRule="auto"/>
+      </w:pPr>
+      <w:r>
+        <w:rPr>
+          <w:color w:val="444444"/>
+          <w:sz w:val="18"/>
+          <w:szCs w:val="18"/>
+        </w:rPr>
+        <w:t>Regulated Industry Ops (</w:t>
+      </w:r>
+      <w:r>
+        <w:rPr>
+          <w:color w:val="444444"/>
+          <w:sz w:val="18"/>
+          <w:szCs w:val="18"/>
+        </w:rPr>
+        <w:t xml:space="preserve">Energy, </w:t>
+      </w:r>
+      <w:r>
+        <w:rPr>
+          <w:color w:val="444444"/>
+          <w:sz w:val="18"/>
+          <w:szCs w:val="18"/>
+        </w:rPr>
+        <w:t>Utilities, Fin</w:t>
+      </w:r>
+      <w:r>
+        <w:rPr>
+          <w:color w:val="444444"/>
+          <w:sz w:val="18"/>
+          <w:szCs w:val="18"/>
+        </w:rPr>
+        <w:t>T</w:t>
+      </w:r>
+      <w:r>
+        <w:rPr>
+          <w:color w:val="444444"/>
+          <w:sz w:val="18"/>
+          <w:szCs w:val="18"/>
+        </w:rPr>
+        <w:t>ech, PCI-DSS)</w:t>
+      </w:r>
+    </w:p>
+    <w:p>
+      <w:pPr>
+        <w:pStyle w:val="ListParagraph"/>
+        <w:numPr>
+          <w:ilvl w:val="0"/>
+          <w:numId w:val="2"/>
+        </w:numPr>
+        <w:spacing w:before="30" w:after="30" w:line="276" w:lineRule="auto"/>
       </w:pPr>
       <w:r>
         <w:rPr>
@@ -1976,7 +2484,7 @@
           <w:ilvl w:val="0"/>
           <w:numId w:val="2"/>
         </w:numPr>
-        <w:spacing w:before="30" w:after="30" w:line="264" w:lineRule="auto"/>
+        <w:spacing w:before="30" w:after="30" w:line="276" w:lineRule="auto"/>
       </w:pPr>
       <w:r>
         <w:rPr>
@@ -1994,7 +2502,7 @@
           <w:ilvl w:val="0"/>
           <w:numId w:val="2"/>
         </w:numPr>
-        <w:spacing w:before="30" w:after="30" w:line="264" w:lineRule="auto"/>
+        <w:spacing w:before="30" w:after="30" w:line="276" w:lineRule="auto"/>
       </w:pPr>
       <w:r>
         <w:rPr>
@@ -2007,7 +2515,7 @@
     </w:p>
     <w:p>
       <w:pPr>
-        <w:spacing w:before="80" w:after="20" w:line="264" w:lineRule="auto"/>
+        <w:spacing w:before="80" w:after="20" w:line="276" w:lineRule="auto"/>
         <w:rPr>
           <w:b/>
           <w:bCs/>
@@ -2044,17 +2552,12 @@
           <w:sz w:val="22"/>
           <w:szCs w:val="22"/>
         </w:rPr>
-        <w:t>TOOLS &amp; TECHNOLOGIES</w:t>
-      </w:r>
-    </w:p>
-    <w:p>
-      <w:pPr>
-        <w:pStyle w:val="ListParagraph"/>
-        <w:numPr>
-          <w:ilvl w:val="0"/>
-          <w:numId w:val="2"/>
-        </w:numPr>
-        <w:spacing w:before="30" w:after="30" w:line="264" w:lineRule="auto"/>
+        <w:t xml:space="preserve">TOOLS &amp; TECHNOLOGIES </w:t>
+      </w:r>
+    </w:p>
+    <w:p>
+      <w:pPr>
+        <w:spacing w:before="80" w:after="20" w:line="276" w:lineRule="auto"/>
         <w:rPr>
           <w:color w:val="444444"/>
           <w:sz w:val="18"/>
@@ -2076,65 +2579,87 @@
           <w:ilvl w:val="0"/>
           <w:numId w:val="2"/>
         </w:numPr>
-        <w:spacing w:before="30" w:after="30" w:line="264" w:lineRule="auto"/>
-      </w:pPr>
-      <w:r>
-        <w:rPr>
-          <w:color w:val="555555"/>
-          <w:sz w:val="18"/>
-          <w:szCs w:val="18"/>
-        </w:rPr>
-        <w:t>Jira</w:t>
-      </w:r>
-    </w:p>
-    <w:p>
-      <w:pPr>
-        <w:pStyle w:val="ListParagraph"/>
-        <w:numPr>
-          <w:ilvl w:val="0"/>
-          <w:numId w:val="2"/>
-        </w:numPr>
-        <w:spacing w:before="30" w:after="30" w:line="264" w:lineRule="auto"/>
-      </w:pPr>
-      <w:r>
-        <w:rPr>
-          <w:color w:val="555555"/>
-          <w:sz w:val="18"/>
-          <w:szCs w:val="18"/>
-        </w:rPr>
-        <w:t>Jira Align</w:t>
-      </w:r>
-    </w:p>
-    <w:p>
-      <w:pPr>
-        <w:pStyle w:val="ListParagraph"/>
-        <w:numPr>
-          <w:ilvl w:val="0"/>
-          <w:numId w:val="2"/>
-        </w:numPr>
-        <w:spacing w:before="30" w:after="30" w:line="264" w:lineRule="auto"/>
-      </w:pPr>
-      <w:r>
-        <w:rPr>
-          <w:color w:val="555555"/>
-          <w:sz w:val="18"/>
-          <w:szCs w:val="18"/>
-        </w:rPr>
-        <w:t>Confluence</w:t>
-      </w:r>
-    </w:p>
-    <w:p>
-      <w:pPr>
-        <w:pStyle w:val="ListParagraph"/>
-        <w:numPr>
-          <w:ilvl w:val="0"/>
-          <w:numId w:val="2"/>
-        </w:numPr>
-        <w:spacing w:before="30" w:after="30" w:line="264" w:lineRule="auto"/>
-      </w:pPr>
-      <w:r>
-        <w:rPr>
-          <w:color w:val="555555"/>
+        <w:spacing w:before="30" w:after="30" w:line="276" w:lineRule="auto"/>
+      </w:pPr>
+      <w:r>
+        <w:rPr>
+          <w:color w:val="444444"/>
+          <w:sz w:val="18"/>
+          <w:szCs w:val="18"/>
+        </w:rPr>
+        <w:t>Agentic AI, LLMs &amp; GenAI, Claude Code, Anthropic API, MCP</w:t>
+      </w:r>
+    </w:p>
+    <w:p>
+      <w:pPr>
+        <w:pStyle w:val="ListParagraph"/>
+        <w:numPr>
+          <w:ilvl w:val="0"/>
+          <w:numId w:val="2"/>
+        </w:numPr>
+        <w:spacing w:before="30" w:after="30" w:line="276" w:lineRule="auto"/>
+      </w:pPr>
+      <w:r>
+        <w:rPr>
+          <w:color w:val="444444"/>
+          <w:sz w:val="18"/>
+          <w:szCs w:val="18"/>
+        </w:rPr>
+        <w:t>Analytics &amp; BI</w:t>
+      </w:r>
+      <w:r>
+        <w:rPr>
+          <w:color w:val="444444"/>
+          <w:sz w:val="18"/>
+          <w:szCs w:val="18"/>
+        </w:rPr>
+        <w:t xml:space="preserve">: </w:t>
+      </w:r>
+      <w:r>
+        <w:rPr>
+          <w:color w:val="444444"/>
+          <w:sz w:val="18"/>
+          <w:szCs w:val="18"/>
+        </w:rPr>
+        <w:t>T</w:t>
+      </w:r>
+      <w:r>
+        <w:rPr>
+          <w:color w:val="444444"/>
+          <w:sz w:val="18"/>
+          <w:szCs w:val="18"/>
+        </w:rPr>
+        <w:t>ableau, Power BI, eazyBI, SQL</w:t>
+      </w:r>
+    </w:p>
+    <w:p>
+      <w:pPr>
+        <w:pStyle w:val="ListParagraph"/>
+        <w:numPr>
+          <w:ilvl w:val="0"/>
+          <w:numId w:val="2"/>
+        </w:numPr>
+        <w:spacing w:before="30" w:after="30" w:line="276" w:lineRule="auto"/>
+      </w:pPr>
+      <w:r>
+        <w:rPr>
+          <w:color w:val="444444"/>
+          <w:sz w:val="18"/>
+          <w:szCs w:val="18"/>
+        </w:rPr>
+        <w:t xml:space="preserve">Jira &amp; Jira Align, Confluence, </w:t>
+      </w:r>
+      <w:r>
+        <w:rPr>
+          <w:color w:val="444444"/>
+          <w:sz w:val="18"/>
+          <w:szCs w:val="18"/>
+        </w:rPr>
+        <w:t xml:space="preserve">Smartsheet, Excel, </w:t>
+      </w:r>
+      <w:r>
+        <w:rPr>
+          <w:color w:val="444444"/>
           <w:sz w:val="18"/>
           <w:szCs w:val="18"/>
         </w:rPr>
@@ -2148,181 +2673,75 @@
           <w:ilvl w:val="0"/>
           <w:numId w:val="2"/>
         </w:numPr>
-        <w:spacing w:before="30" w:after="30" w:line="264" w:lineRule="auto"/>
-      </w:pPr>
-      <w:r>
-        <w:rPr>
-          <w:color w:val="555555"/>
-          <w:sz w:val="18"/>
-          <w:szCs w:val="18"/>
-        </w:rPr>
-        <w:t>Tableau</w:t>
-      </w:r>
-    </w:p>
-    <w:p>
-      <w:pPr>
-        <w:pStyle w:val="ListParagraph"/>
-        <w:numPr>
-          <w:ilvl w:val="0"/>
-          <w:numId w:val="2"/>
-        </w:numPr>
-        <w:spacing w:before="30" w:after="30" w:line="264" w:lineRule="auto"/>
-      </w:pPr>
-      <w:r>
-        <w:rPr>
-          <w:color w:val="555555"/>
-          <w:sz w:val="18"/>
-          <w:szCs w:val="18"/>
-        </w:rPr>
-        <w:t>Power BI</w:t>
-      </w:r>
-    </w:p>
-    <w:p>
-      <w:pPr>
-        <w:pStyle w:val="ListParagraph"/>
-        <w:numPr>
-          <w:ilvl w:val="0"/>
-          <w:numId w:val="2"/>
-        </w:numPr>
-        <w:spacing w:before="30" w:after="30" w:line="264" w:lineRule="auto"/>
-      </w:pPr>
-      <w:r>
-        <w:rPr>
-          <w:color w:val="555555"/>
-          <w:sz w:val="18"/>
-          <w:szCs w:val="18"/>
-        </w:rPr>
-        <w:t>e</w:t>
-      </w:r>
-      <w:r>
-        <w:rPr>
-          <w:color w:val="555555"/>
-          <w:sz w:val="18"/>
-          <w:szCs w:val="18"/>
-        </w:rPr>
-        <w:t>azyBI</w:t>
-      </w:r>
-    </w:p>
-    <w:p>
-      <w:pPr>
-        <w:pStyle w:val="ListParagraph"/>
-        <w:numPr>
-          <w:ilvl w:val="0"/>
-          <w:numId w:val="2"/>
-        </w:numPr>
-        <w:spacing w:before="30" w:after="30" w:line="264" w:lineRule="auto"/>
-      </w:pPr>
-      <w:r>
-        <w:rPr>
-          <w:color w:val="555555"/>
-          <w:sz w:val="18"/>
-          <w:szCs w:val="18"/>
-        </w:rPr>
-        <w:t>SQL</w:t>
-      </w:r>
-    </w:p>
-    <w:p>
-      <w:pPr>
-        <w:pStyle w:val="ListParagraph"/>
-        <w:numPr>
-          <w:ilvl w:val="0"/>
-          <w:numId w:val="2"/>
-        </w:numPr>
-        <w:spacing w:before="30" w:after="30" w:line="264" w:lineRule="auto"/>
-      </w:pPr>
-      <w:r>
-        <w:rPr>
-          <w:color w:val="555555"/>
-          <w:sz w:val="18"/>
-          <w:szCs w:val="18"/>
-        </w:rPr>
-        <w:t>AWS</w:t>
-      </w:r>
-    </w:p>
-    <w:p>
-      <w:pPr>
-        <w:pStyle w:val="ListParagraph"/>
-        <w:numPr>
-          <w:ilvl w:val="0"/>
-          <w:numId w:val="2"/>
-        </w:numPr>
-        <w:spacing w:before="30" w:after="30" w:line="264" w:lineRule="auto"/>
-      </w:pPr>
-      <w:r>
-        <w:rPr>
-          <w:color w:val="555555"/>
-          <w:sz w:val="18"/>
-          <w:szCs w:val="18"/>
-        </w:rPr>
-        <w:t>Python</w:t>
-      </w:r>
-    </w:p>
-    <w:p>
-      <w:pPr>
-        <w:pStyle w:val="ListParagraph"/>
-        <w:numPr>
-          <w:ilvl w:val="0"/>
-          <w:numId w:val="2"/>
-        </w:numPr>
-        <w:spacing w:before="30" w:after="30" w:line="264" w:lineRule="auto"/>
-      </w:pPr>
-      <w:r>
-        <w:rPr>
-          <w:color w:val="555555"/>
-          <w:sz w:val="18"/>
-          <w:szCs w:val="18"/>
-        </w:rPr>
-        <w:t>PowerShell</w:t>
-      </w:r>
-    </w:p>
-    <w:p>
-      <w:pPr>
-        <w:pStyle w:val="ListParagraph"/>
-        <w:numPr>
-          <w:ilvl w:val="0"/>
-          <w:numId w:val="2"/>
-        </w:numPr>
-        <w:spacing w:before="30" w:after="30" w:line="264" w:lineRule="auto"/>
-      </w:pPr>
-      <w:r>
-        <w:rPr>
-          <w:color w:val="555555"/>
-          <w:sz w:val="18"/>
-          <w:szCs w:val="18"/>
-        </w:rPr>
-        <w:t>Java</w:t>
-      </w:r>
-    </w:p>
-    <w:p>
-      <w:pPr>
-        <w:pStyle w:val="ListParagraph"/>
-        <w:numPr>
-          <w:ilvl w:val="0"/>
-          <w:numId w:val="2"/>
-        </w:numPr>
-        <w:spacing w:before="30" w:after="30" w:line="264" w:lineRule="auto"/>
-      </w:pPr>
-      <w:r>
-        <w:rPr>
-          <w:color w:val="555555"/>
-          <w:sz w:val="18"/>
-          <w:szCs w:val="18"/>
-        </w:rPr>
-        <w:t>ANSI C</w:t>
-      </w:r>
-    </w:p>
-    <w:p>
-      <w:pPr>
-        <w:pStyle w:val="ListParagraph"/>
-        <w:numPr>
-          <w:ilvl w:val="0"/>
-          <w:numId w:val="2"/>
-        </w:numPr>
-        <w:spacing w:before="30" w:after="30" w:line="264" w:lineRule="auto"/>
-      </w:pPr>
-      <w:r>
-        <w:rPr>
-          <w:color w:val="555555"/>
+        <w:spacing w:before="30" w:after="30" w:line="276" w:lineRule="auto"/>
+      </w:pPr>
+      <w:r>
+        <w:rPr>
+          <w:color w:val="444444"/>
+          <w:sz w:val="18"/>
+          <w:szCs w:val="18"/>
+        </w:rPr>
+        <w:t>ANSI C,</w:t>
+      </w:r>
+      <w:r>
+        <w:rPr>
+          <w:color w:val="444444"/>
+          <w:sz w:val="18"/>
+          <w:szCs w:val="18"/>
+        </w:rPr>
+        <w:t xml:space="preserve"> </w:t>
+      </w:r>
+      <w:r>
+        <w:rPr>
+          <w:color w:val="444444"/>
+          <w:sz w:val="18"/>
+          <w:szCs w:val="18"/>
+        </w:rPr>
+        <w:t>Java, Python,</w:t>
+      </w:r>
+      <w:r>
+        <w:rPr>
+          <w:color w:val="444444"/>
+          <w:sz w:val="18"/>
+          <w:szCs w:val="18"/>
+        </w:rPr>
+        <w:t xml:space="preserve"> </w:t>
+      </w:r>
+      <w:r>
+        <w:rPr>
+          <w:color w:val="444444"/>
+          <w:sz w:val="18"/>
+          <w:szCs w:val="18"/>
+        </w:rPr>
+        <w:t>Swift</w:t>
+      </w:r>
+      <w:r>
+        <w:rPr>
+          <w:color w:val="444444"/>
+          <w:sz w:val="18"/>
+          <w:szCs w:val="18"/>
+        </w:rPr>
+        <w:t>,</w:t>
+      </w:r>
+      <w:r>
+        <w:rPr>
+          <w:color w:val="444444"/>
+          <w:sz w:val="18"/>
+          <w:szCs w:val="18"/>
+        </w:rPr>
+        <w:t xml:space="preserve"> PowerShell</w:t>
+      </w:r>
+      <w:r>
+        <w:rPr>
+          <w:color w:val="444444"/>
+          <w:sz w:val="18"/>
+          <w:szCs w:val="18"/>
+        </w:rPr>
+        <w:t xml:space="preserve">, </w:t>
+      </w:r>
+      <w:r>
+        <w:rPr>
+          <w:color w:val="444444"/>
           <w:sz w:val="18"/>
           <w:szCs w:val="18"/>
         </w:rPr>
@@ -2336,117 +2755,121 @@
           <w:ilvl w:val="0"/>
           <w:numId w:val="2"/>
         </w:numPr>
-        <w:spacing w:before="30" w:after="30" w:line="264" w:lineRule="auto"/>
-      </w:pPr>
-      <w:r>
-        <w:rPr>
-          <w:color w:val="555555"/>
+        <w:spacing w:before="30" w:after="30" w:line="276" w:lineRule="auto"/>
+      </w:pPr>
+      <w:r>
+        <w:rPr>
+          <w:color w:val="444444"/>
+          <w:sz w:val="18"/>
+          <w:szCs w:val="18"/>
+        </w:rPr>
+        <w:t xml:space="preserve">GitHub/Git, </w:t>
+      </w:r>
+      <w:r>
+        <w:rPr>
+          <w:color w:val="444444"/>
+          <w:sz w:val="18"/>
+          <w:szCs w:val="18"/>
+        </w:rPr>
+        <w:t>GitHub Actions</w:t>
+      </w:r>
+      <w:r>
+        <w:rPr>
+          <w:color w:val="444444"/>
+          <w:sz w:val="18"/>
+          <w:szCs w:val="18"/>
+        </w:rPr>
+        <w:t xml:space="preserve">, </w:t>
+      </w:r>
+      <w:r>
+        <w:rPr>
+          <w:color w:val="444444"/>
           <w:sz w:val="18"/>
           <w:szCs w:val="18"/>
         </w:rPr>
         <w:t>REST APIs</w:t>
       </w:r>
-    </w:p>
-    <w:p>
-      <w:pPr>
-        <w:pStyle w:val="ListParagraph"/>
-        <w:numPr>
-          <w:ilvl w:val="0"/>
-          <w:numId w:val="2"/>
-        </w:numPr>
-        <w:spacing w:before="30" w:after="30" w:line="264" w:lineRule="auto"/>
-      </w:pPr>
-      <w:r>
-        <w:rPr>
-          <w:color w:val="555555"/>
-          <w:sz w:val="18"/>
-          <w:szCs w:val="18"/>
-        </w:rPr>
-        <w:t>Git</w:t>
-      </w:r>
-    </w:p>
-    <w:p>
-      <w:pPr>
-        <w:pStyle w:val="ListParagraph"/>
-        <w:numPr>
-          <w:ilvl w:val="0"/>
-          <w:numId w:val="2"/>
-        </w:numPr>
-        <w:spacing w:before="30" w:after="30" w:line="264" w:lineRule="auto"/>
-      </w:pPr>
-      <w:r>
-        <w:rPr>
-          <w:color w:val="555555"/>
+      <w:r>
+        <w:rPr>
+          <w:color w:val="444444"/>
+          <w:sz w:val="18"/>
+          <w:szCs w:val="18"/>
+        </w:rPr>
+        <w:t>, Xcode</w:t>
+      </w:r>
+      <w:r>
+        <w:rPr>
+          <w:color w:val="444444"/>
+          <w:sz w:val="18"/>
+          <w:szCs w:val="18"/>
+        </w:rPr>
+        <w:t>, TestFlight</w:t>
+      </w:r>
+    </w:p>
+    <w:p>
+      <w:pPr>
+        <w:pStyle w:val="ListParagraph"/>
+        <w:numPr>
+          <w:ilvl w:val="0"/>
+          <w:numId w:val="2"/>
+        </w:numPr>
+        <w:spacing w:before="30" w:after="30" w:line="276" w:lineRule="auto"/>
+      </w:pPr>
+      <w:r>
+        <w:rPr>
+          <w:color w:val="444444"/>
+          <w:sz w:val="18"/>
+          <w:szCs w:val="18"/>
+        </w:rPr>
+        <w:t>Cloud Platforms</w:t>
+      </w:r>
+      <w:r>
+        <w:rPr>
+          <w:color w:val="444444"/>
+          <w:sz w:val="18"/>
+          <w:szCs w:val="18"/>
+        </w:rPr>
+        <w:t xml:space="preserve">: </w:t>
+      </w:r>
+      <w:r>
+        <w:rPr>
+          <w:color w:val="444444"/>
           <w:sz w:val="18"/>
           <w:szCs w:val="18"/>
         </w:rPr>
         <w:t>Cloudflare</w:t>
       </w:r>
-    </w:p>
-    <w:p>
-      <w:pPr>
-        <w:pStyle w:val="ListParagraph"/>
-        <w:numPr>
-          <w:ilvl w:val="0"/>
-          <w:numId w:val="2"/>
-        </w:numPr>
-        <w:spacing w:before="30" w:after="30" w:line="264" w:lineRule="auto"/>
-      </w:pPr>
-      <w:r>
-        <w:rPr>
-          <w:color w:val="555555"/>
-          <w:sz w:val="18"/>
-          <w:szCs w:val="18"/>
-        </w:rPr>
-        <w:t>Swift</w:t>
-      </w:r>
-    </w:p>
-    <w:p>
-      <w:pPr>
-        <w:pStyle w:val="ListParagraph"/>
-        <w:numPr>
-          <w:ilvl w:val="0"/>
-          <w:numId w:val="2"/>
-        </w:numPr>
-        <w:spacing w:before="30" w:after="30" w:line="264" w:lineRule="auto"/>
-      </w:pPr>
-      <w:r>
-        <w:rPr>
-          <w:color w:val="555555"/>
-          <w:sz w:val="18"/>
-          <w:szCs w:val="18"/>
-        </w:rPr>
-        <w:t>TypeScript</w:t>
-      </w:r>
-    </w:p>
-    <w:p>
-      <w:pPr>
-        <w:pStyle w:val="ListParagraph"/>
-        <w:numPr>
-          <w:ilvl w:val="0"/>
-          <w:numId w:val="2"/>
-        </w:numPr>
-        <w:spacing w:before="30" w:after="30" w:line="264" w:lineRule="auto"/>
+      <w:r>
+        <w:rPr>
+          <w:color w:val="444444"/>
+          <w:sz w:val="18"/>
+          <w:szCs w:val="18"/>
+        </w:rPr>
+        <w:t>, AWS</w:t>
+      </w:r>
+    </w:p>
+    <w:p>
+      <w:pPr>
+        <w:spacing w:before="80" w:after="20" w:line="276" w:lineRule="auto"/>
+        <w:rPr>
+          <w:b/>
+          <w:bCs/>
+          <w:color w:val="444444"/>
+          <w:sz w:val="18"/>
+          <w:szCs w:val="18"/>
+        </w:rPr>
         <w:sectPr>
           <w:type w:val="continuous"/>
           <w:pgSz w:w="12240" w:h="15840"/>
           <w:pgMar w:top="680" w:right="800" w:bottom="680" w:left="800" w:header="708" w:footer="708" w:gutter="0"/>
-          <w:cols w:num="4" w:space="720"/>
+          <w:cols w:num="2" w:space="720"/>
           <w:docGrid w:linePitch="360"/>
         </w:sectPr>
       </w:pPr>
-      <w:r>
-        <w:rPr>
-          <w:color w:val="555555"/>
-          <w:sz w:val="18"/>
-          <w:szCs w:val="18"/>
-        </w:rPr>
-        <w:t>React</w:t>
-      </w:r>
-    </w:p>
-    <w:p>
-      <w:pPr>
-        <w:spacing w:before="220" w:after="60"/>
+    </w:p>
+    <w:p>
+      <w:pPr>
+        <w:spacing w:before="220" w:after="60" w:line="276" w:lineRule="auto"/>
       </w:pPr>
     </w:p>
     <w:sectPr>
@@ -3275,6 +3698,7 @@
   <w:style w:type="character" w:default="1" w:styleId="DefaultParagraphFont">
     <w:name w:val="Default Paragraph Font"/>
     <w:uiPriority w:val="1"/>
+    <w:semiHidden/>
     <w:unhideWhenUsed/>
   </w:style>
   <w:style w:type="table" w:default="1" w:styleId="TableNormal">

</xml_diff>